<commit_message>
Add design wireframe to Design Document — show planned layout before the built interface
Adds a wireframe of the Answer Browser (sidebar filters, question panel,
reference answer, model-answer cards) sketched out before pipeline/dashboard.py
was written, paired with the live screenshot so the document tells the full
design-to-build story rather than only showing the finished result.
</commit_message>
<xml_diff>
--- a/documents/Design_Document.docx
+++ b/documents/Design_Document.docx
@@ -263,7 +263,66 @@
         <w:rPr>
           <w:sz w:val="22"/>
         </w:rPr>
-        <w:t>pipeline/dashboard.py turns the scored evidence in eval.csv into a browsable, filterable interface — the "LLM Coding Benchmark Dashboard" shown below, running locally at localhost:8501. The screenshot is a real, working session of the tool, not a mock-up.</w:t>
+        <w:t>Before pipeline/dashboard.py was written, the Answer Browser layout was sketched out as a wireframe — which regions the page needed (filters, the question itself, the reference answer, and a row of model-answer cards) and how a reader's eye would move through them. That plan is shown first below, followed by the working interface that was built from it.</w:t>
+      </w:r>
+    </w:p>
+    <w:p>
+      <w:pPr>
+        <w:jc w:val="center"/>
+      </w:pPr>
+      <w:r>
+        <w:drawing>
+          <wp:inline xmlns:a="http://schemas.openxmlformats.org/drawingml/2006/main" xmlns:pic="http://schemas.openxmlformats.org/drawingml/2006/picture">
+            <wp:extent cx="5120640" cy="3534473"/>
+            <wp:docPr id="3" name="Picture 3"/>
+            <wp:cNvGraphicFramePr>
+              <a:graphicFrameLocks noChangeAspect="1"/>
+            </wp:cNvGraphicFramePr>
+            <a:graphic>
+              <a:graphicData uri="http://schemas.openxmlformats.org/drawingml/2006/picture">
+                <pic:pic>
+                  <pic:nvPicPr>
+                    <pic:cNvPr id="0" name="dashboard_design_wireframe.png"/>
+                    <pic:cNvPicPr/>
+                  </pic:nvPicPr>
+                  <pic:blipFill>
+                    <a:blip r:embed="rId11"/>
+                    <a:stretch>
+                      <a:fillRect/>
+                    </a:stretch>
+                  </pic:blipFill>
+                  <pic:spPr>
+                    <a:xfrm>
+                      <a:off x="0" y="0"/>
+                      <a:ext cx="5120640" cy="3534473"/>
+                    </a:xfrm>
+                    <a:prstGeom prst="rect"/>
+                  </pic:spPr>
+                </pic:pic>
+              </a:graphicData>
+            </a:graphic>
+          </wp:inline>
+        </w:drawing>
+      </w:r>
+    </w:p>
+    <w:p>
+      <w:pPr>
+        <w:jc w:val="center"/>
+      </w:pPr>
+      <w:r>
+        <w:rPr>
+          <w:i/>
+          <w:sz w:val="19"/>
+        </w:rPr>
+        <w:t>Figure 2: The Answer Browser, designed as a wireframe before any interface code was written. Dashed boxes mark layout regions, not final styling — a sidebar for filters and question selection, a header for the selected question's metadata, panels for the question text and the Stack Overflow reference answer, and a repeatable row of model-answer cards pairing each answer with its judge score and verdict.</w:t>
+      </w:r>
+    </w:p>
+    <w:p>
+      <w:r>
+        <w:rPr>
+          <w:sz w:val="22"/>
+        </w:rPr>
+        <w:t>Once the pipeline was producing real scored data, the interface was built to this plan using Streamlit. Here is that same Answer Browser view, running live and loaded with the actual benchmark evidence:</w:t>
       </w:r>
     </w:p>
     <w:p>
@@ -314,7 +373,7 @@
           <w:i/>
           <w:sz w:val="19"/>
         </w:rPr>
-        <w:t>Figure 2: The dashboard's Answer Browser tab. The sidebar lets a reader filter the 30 questions by category and difficulty (here, all 30 match); selecting a question — Q01, a Debugging / Beginner question about a pandas DataFrame .append() error — shows the original question text, the Stack Overflow accepted answer used as the reference, and each model's answer alongside the judge's score and verdict (claude-sonnet-4-6 scored 3 — Optimal).</w:t>
+        <w:t>Figure 3: The dashboard's Answer Browser tab. The sidebar lets a reader filter the 30 questions by category and difficulty (here, all 30 match); selecting a question — Q01, a Debugging / Beginner question about a pandas DataFrame .append() error — shows the original question text, the Stack Overflow accepted answer used as the reference, and each model's answer alongside the judge's score and verdict (claude-sonnet-4-6 scored 3 — Optimal).</w:t>
       </w:r>
     </w:p>
     <w:p/>

</xml_diff>